<commit_message>
JCPA formatting pass (abstract<=100w, 12pt, double spacing, minimal table rules)
</commit_message>
<xml_diff>
--- a/JCPA_cover_letter_FINAL.docx
+++ b/JCPA_cover_letter_FINAL.docx
@@ -438,7 +438,7 @@
     <w:rPr>
       <w:rFonts w:ascii="Times New Roman" w:hAnsi="Times New Roman" w:eastAsia="Times New Roman"/>
       <w:b w:val="0"/>
-      <w:sz w:val="20"/>
+      <w:sz w:val="24"/>
     </w:rPr>
   </w:style>
   <w:style w:type="paragraph" w:styleId="Header">
@@ -528,7 +528,7 @@
       <w:b/>
       <w:bCs/>
       <w:color w:val="4F81BD" w:themeColor="accent1"/>
-      <w:sz w:val="22"/>
+      <w:sz w:val="24"/>
       <w:szCs w:val="26"/>
     </w:rPr>
   </w:style>

</xml_diff>